<commit_message>
Fix Word docx compatibility
Co-authored-by: Cursor <cursoragent@cursor.com>
</commit_message>
<xml_diff>
--- a/docs/submission/20260705/pre-fixed-fare-submission-full-set-v1-candidate.docx
+++ b/docs/submission/20260705/pre-fixed-fare-submission-full-set-v1-candidate.docx
@@ -1336,7 +1336,7 @@
           <wp:inline distT="0" distB="0" distL="0" distR="0">
             <wp:extent cx="4953000" cy="6191250"/>
             <wp:effectExtent t="0" r="0" b="0" l="0"/>
-            <wp:docPr id="1" descr="利用者の走行予定ルート選択画面" title="利用者の走行予定ルート選択画面"/>
+            <wp:docPr id="1" name="" descr="" title=""/>
             <wp:cNvGraphicFramePr>
               <a:graphicFrameLocks xmlns:a="http://schemas.openxmlformats.org/drawingml/2006/main" noChangeAspect="1"/>
             </wp:cNvGraphicFramePr>
@@ -1440,7 +1440,7 @@
           <wp:inline distT="0" distB="0" distL="0" distR="0">
             <wp:extent cx="4953000" cy="4476750"/>
             <wp:effectExtent t="0" r="0" b="0" l="0"/>
-            <wp:docPr id="1" descr="旅客同意確認画面" title="旅客同意確認画面"/>
+            <wp:docPr id="1" name="" descr="" title=""/>
             <wp:cNvGraphicFramePr>
               <a:graphicFrameLocks xmlns:a="http://schemas.openxmlformats.org/drawingml/2006/main" noChangeAspect="1"/>
             </wp:cNvGraphicFramePr>
@@ -1544,7 +1544,7 @@
           <wp:inline distT="0" distB="0" distL="0" distR="0">
             <wp:extent cx="4953000" cy="3238500"/>
             <wp:effectExtent t="0" r="0" b="0" l="0"/>
-            <wp:docPr id="1" descr="ドライバー用確定ルート確認画面" title="ドライバー用確定ルート確認画面"/>
+            <wp:docPr id="1" name="" descr="" title=""/>
             <wp:cNvGraphicFramePr>
               <a:graphicFrameLocks xmlns:a="http://schemas.openxmlformats.org/drawingml/2006/main" noChangeAspect="1"/>
             </wp:cNvGraphicFramePr>
@@ -1648,7 +1648,7 @@
           <wp:inline distT="0" distB="0" distL="0" distR="0">
             <wp:extent cx="4953000" cy="15478125"/>
             <wp:effectExtent t="0" r="0" b="0" l="0"/>
-            <wp:docPr id="1" descr="領収書・レシート明細画面" title="領収書・レシート明細画面"/>
+            <wp:docPr id="1" name="" descr="" title=""/>
             <wp:cNvGraphicFramePr>
               <a:graphicFrameLocks xmlns:a="http://schemas.openxmlformats.org/drawingml/2006/main" noChangeAspect="1"/>
             </wp:cNvGraphicFramePr>

</xml_diff>